<commit_message>
NEW PLANTAILLA PARA JHONZ
</commit_message>
<xml_diff>
--- a/uploads/templates/jhon/plantilla.docx
+++ b/uploads/templates/jhon/plantilla.docx
@@ -2,9 +2,24 @@
 <file path=word/document.xml><?xml version="1.0" encoding="utf-8"?>
 <w:document xmlns:wpc="http://schemas.microsoft.com/office/word/2010/wordprocessingCanvas" xmlns:cx="http://schemas.microsoft.com/office/drawing/2014/chartex" xmlns:cx1="http://schemas.microsoft.com/office/drawing/2015/9/8/chartex" xmlns:cx2="http://schemas.microsoft.com/office/drawing/2015/10/21/chartex" xmlns:cx3="http://schemas.microsoft.com/office/drawing/2016/5/9/chartex" xmlns:cx4="http://schemas.microsoft.com/office/drawing/2016/5/10/chartex" xmlns:cx5="http://schemas.microsoft.com/office/drawing/2016/5/11/chartex" xmlns:cx6="http://schemas.microsoft.com/office/drawing/2016/5/12/chartex" xmlns:cx7="http://schemas.microsoft.com/office/drawing/2016/5/13/chartex" xmlns:cx8="http://schemas.microsoft.com/office/drawing/2016/5/14/chartex" xmlns:mc="http://schemas.openxmlformats.org/markup-compatibility/2006" xmlns:aink="http://schemas.microsoft.com/office/drawing/2016/ink" xmlns:am3d="http://schemas.microsoft.com/office/drawing/2017/model3d" xmlns:o="urn:schemas-microsoft-com:office:office" xmlns:oel="http://schemas.microsoft.com/office/2019/extlst" xmlns:r="http://schemas.openxmlformats.org/officeDocument/2006/relationships" xmlns:m="http://schemas.openxmlformats.org/officeDocument/2006/math" xmlns:v="urn:schemas-microsoft-com:vml" xmlns:wp14="http://schemas.microsoft.com/office/word/2010/wordprocessingDrawing" xmlns:wp="http://schemas.openxmlformats.org/drawingml/2006/wordprocessingDrawing" xmlns:w10="urn:schemas-microsoft-com:office:word" xmlns:w="http://schemas.openxmlformats.org/wordprocessingml/2006/main" xmlns:w14="http://schemas.microsoft.com/office/word/2010/wordml" xmlns:w15="http://schemas.microsoft.com/office/word/2012/wordml" xmlns:w16cex="http://schemas.microsoft.com/office/word/2018/wordml/cex" xmlns:w16cid="http://schemas.microsoft.com/office/word/2016/wordml/cid" xmlns:w16="http://schemas.microsoft.com/office/word/2018/wordml" xmlns:w16du="http://schemas.microsoft.com/office/word/2023/wordml/word16du" xmlns:w16sdtdh="http://schemas.microsoft.com/office/word/2020/wordml/sdtdatahash" xmlns:w16sdtfl="http://schemas.microsoft.com/office/word/2024/wordml/sdtformatlock" xmlns:w16se="http://schemas.microsoft.com/office/word/2015/wordml/symex" xmlns:wpg="http://schemas.microsoft.com/office/word/2010/wordprocessingGroup" xmlns:wpi="http://schemas.microsoft.com/office/word/2010/wordprocessingInk" xmlns:wne="http://schemas.microsoft.com/office/word/2006/wordml" xmlns:wps="http://schemas.microsoft.com/office/word/2010/wordprocessingShape" mc:Ignorable="w14 w15 w16se w16cid w16 w16cex w16sdtdh w16sdtfl w16du wp14">
   <w:body>
+    <w:p>
+      <w:pPr>
+        <w:rPr>
+          <w:lang w:val="es-MX"/>
+        </w:rPr>
+      </w:pPr>
+    </w:p>
+    <w:p>
+      <w:pPr>
+        <w:rPr>
+          <w:lang w:val="es-MX"/>
+        </w:rPr>
+      </w:pPr>
+    </w:p>
     <w:tbl>
       <w:tblPr>
         <w:tblStyle w:val="Tablaconcuadrcula"/>
+        <w:tblpPr w:leftFromText="141" w:rightFromText="141" w:vertAnchor="text" w:horzAnchor="margin" w:tblpY="206"/>
         <w:tblW w:w="0" w:type="auto"/>
         <w:tblLook w:val="04A0" w:firstRow="1" w:lastRow="0" w:firstColumn="1" w:lastColumn="0" w:noHBand="0" w:noVBand="1"/>
       </w:tblPr>
@@ -58,92 +73,22 @@
       </w:tr>
     </w:tbl>
     <w:p>
-      <w:r>
+      <w:pPr>
         <w:rPr>
           <w:noProof/>
           <w:lang w:val="es-MX"/>
         </w:rPr>
-        <w:drawing>
-          <wp:anchor distT="0" distB="0" distL="114300" distR="114300" simplePos="0" relativeHeight="251659264" behindDoc="1" locked="0" layoutInCell="1" allowOverlap="1" wp14:anchorId="787C6561" wp14:editId="6789668A">
-            <wp:simplePos x="0" y="0"/>
-            <wp:positionH relativeFrom="margin">
-              <wp:posOffset>1308227</wp:posOffset>
-            </wp:positionH>
-            <wp:positionV relativeFrom="paragraph">
-              <wp:posOffset>1831975</wp:posOffset>
-            </wp:positionV>
-            <wp:extent cx="3860165" cy="3623712"/>
-            <wp:effectExtent l="0" t="0" r="6985" b="0"/>
-            <wp:wrapNone/>
-            <wp:docPr id="36190429" name="Imagen 4"/>
-            <wp:cNvGraphicFramePr>
-              <a:graphicFrameLocks xmlns:a="http://schemas.openxmlformats.org/drawingml/2006/main" noChangeAspect="1"/>
-            </wp:cNvGraphicFramePr>
-            <a:graphic xmlns:a="http://schemas.openxmlformats.org/drawingml/2006/main">
-              <a:graphicData uri="http://schemas.openxmlformats.org/drawingml/2006/picture">
-                <pic:pic xmlns:pic="http://schemas.openxmlformats.org/drawingml/2006/picture">
-                  <pic:nvPicPr>
-                    <pic:cNvPr id="0" name="Picture 2"/>
-                    <pic:cNvPicPr>
-                      <a:picLocks noChangeAspect="1" noChangeArrowheads="1"/>
-                    </pic:cNvPicPr>
-                  </pic:nvPicPr>
-                  <pic:blipFill rotWithShape="1">
-                    <a:blip r:embed="rId6" cstate="print">
-                      <a:alphaModFix amt="20000"/>
-                      <a:extLst>
-                        <a:ext uri="{BEBA8EAE-BF5A-486C-A8C5-ECC9F3942E4B}">
-                          <a14:imgProps xmlns:a14="http://schemas.microsoft.com/office/drawing/2010/main">
-                            <a14:imgLayer r:embed="rId7">
-                              <a14:imgEffect>
-                                <a14:brightnessContrast bright="40000" contrast="-40000"/>
-                              </a14:imgEffect>
-                            </a14:imgLayer>
-                          </a14:imgProps>
-                        </a:ext>
-                        <a:ext uri="{28A0092B-C50C-407E-A947-70E740481C1C}">
-                          <a14:useLocalDpi xmlns:a14="http://schemas.microsoft.com/office/drawing/2010/main" val="0"/>
-                        </a:ext>
-                      </a:extLst>
-                    </a:blip>
-                    <a:srcRect l="15817" r="16665"/>
-                    <a:stretch>
-                      <a:fillRect/>
-                    </a:stretch>
-                  </pic:blipFill>
-                  <pic:spPr bwMode="auto">
-                    <a:xfrm>
-                      <a:off x="0" y="0"/>
-                      <a:ext cx="3860165" cy="3623712"/>
-                    </a:xfrm>
-                    <a:prstGeom prst="rect">
-                      <a:avLst/>
-                    </a:prstGeom>
-                    <a:noFill/>
-                    <a:ln>
-                      <a:noFill/>
-                    </a:ln>
-                    <a:extLst>
-                      <a:ext uri="{53640926-AAD7-44D8-BBD7-CCE9431645EC}">
-                        <a14:shadowObscured xmlns:a14="http://schemas.microsoft.com/office/drawing/2010/main"/>
-                      </a:ext>
-                    </a:extLst>
-                  </pic:spPr>
-                </pic:pic>
-              </a:graphicData>
-            </a:graphic>
-            <wp14:sizeRelH relativeFrom="page">
-              <wp14:pctWidth>0</wp14:pctWidth>
-            </wp14:sizeRelH>
-            <wp14:sizeRelV relativeFrom="page">
-              <wp14:pctHeight>0</wp14:pctHeight>
-            </wp14:sizeRelV>
-          </wp:anchor>
-        </w:drawing>
-      </w:r>
+      </w:pPr>
+    </w:p>
+    <w:p>
+      <w:pPr>
+        <w:rPr>
+          <w:lang w:val="es-MX"/>
+        </w:rPr>
+      </w:pPr>
     </w:p>
     <w:sectPr>
-      <w:headerReference w:type="default" r:id="rId8"/>
+      <w:headerReference w:type="default" r:id="rId7"/>
       <w:pgSz w:w="11906" w:h="16838"/>
       <w:pgMar w:top="1701" w:right="851" w:bottom="1418" w:left="851" w:header="708" w:footer="708" w:gutter="0"/>
       <w:cols w:space="708"/>
@@ -213,14 +158,201 @@
       <w:rPr>
         <w:noProof/>
       </w:rPr>
+      <mc:AlternateContent>
+        <mc:Choice Requires="wps">
+          <w:drawing>
+            <wp:anchor distT="0" distB="0" distL="114300" distR="114300" simplePos="0" relativeHeight="251661312" behindDoc="1" locked="0" layoutInCell="1" allowOverlap="1" wp14:anchorId="0F30BED5" wp14:editId="664275AE">
+              <wp:simplePos x="0" y="0"/>
+              <wp:positionH relativeFrom="column">
+                <wp:posOffset>2091690</wp:posOffset>
+              </wp:positionH>
+              <wp:positionV relativeFrom="paragraph">
+                <wp:posOffset>-220980</wp:posOffset>
+              </wp:positionV>
+              <wp:extent cx="1600200" cy="247650"/>
+              <wp:effectExtent l="0" t="0" r="0" b="0"/>
+              <wp:wrapNone/>
+              <wp:docPr id="334908504" name="Rectángulo 1"/>
+              <wp:cNvGraphicFramePr/>
+              <a:graphic xmlns:a="http://schemas.openxmlformats.org/drawingml/2006/main">
+                <a:graphicData uri="http://schemas.microsoft.com/office/word/2010/wordprocessingShape">
+                  <wps:wsp>
+                    <wps:cNvSpPr/>
+                    <wps:spPr>
+                      <a:xfrm>
+                        <a:off x="0" y="0"/>
+                        <a:ext cx="1600200" cy="247650"/>
+                      </a:xfrm>
+                      <a:prstGeom prst="rect">
+                        <a:avLst/>
+                      </a:prstGeom>
+                      <a:noFill/>
+                      <a:ln>
+                        <a:noFill/>
+                      </a:ln>
+                    </wps:spPr>
+                    <wps:style>
+                      <a:lnRef idx="2">
+                        <a:schemeClr val="accent6"/>
+                      </a:lnRef>
+                      <a:fillRef idx="1">
+                        <a:schemeClr val="lt1"/>
+                      </a:fillRef>
+                      <a:effectRef idx="0">
+                        <a:schemeClr val="accent6"/>
+                      </a:effectRef>
+                      <a:fontRef idx="minor">
+                        <a:schemeClr val="dk1"/>
+                      </a:fontRef>
+                    </wps:style>
+                    <wps:txbx>
+                      <w:txbxContent>
+                        <w:p>
+                          <w:pPr>
+                            <w:rPr>
+                              <w:rFonts w:ascii="Times New Roman" w:hAnsi="Times New Roman" w:cs="Times New Roman"/>
+                              <w:b/>
+                              <w:bCs/>
+                              <w:color w:val="0A2F41" w:themeColor="accent1" w:themeShade="80"/>
+                              <w:sz w:val="22"/>
+                              <w:szCs w:val="22"/>
+                              <w:lang w:val="es-MX"/>
+                              <w14:textOutline w14:w="0" w14:cap="flat" w14:cmpd="sng" w14:algn="ctr">
+                                <w14:noFill/>
+                                <w14:prstDash w14:val="solid"/>
+                                <w14:round/>
+                              </w14:textOutline>
+                              <w14:props3d w14:extrusionH="57150" w14:contourW="0" w14:prstMaterial="matte">
+                                <w14:bevelT w14:w="63500" w14:h="12700" w14:prst="angle"/>
+                                <w14:contourClr>
+                                  <w14:schemeClr w14:val="bg1">
+                                    <w14:lumMod w14:val="65000"/>
+                                  </w14:schemeClr>
+                                </w14:contourClr>
+                              </w14:props3d>
+                            </w:rPr>
+                          </w:pPr>
+                          <w:r>
+                            <w:rPr>
+                              <w:rFonts w:ascii="Times New Roman" w:hAnsi="Times New Roman" w:cs="Times New Roman"/>
+                              <w:b/>
+                              <w:bCs/>
+                              <w:color w:val="0A2F41" w:themeColor="accent1" w:themeShade="80"/>
+                              <w:sz w:val="22"/>
+                              <w:szCs w:val="22"/>
+                              <w:lang w:val="es-MX"/>
+                              <w14:textOutline w14:w="0" w14:cap="flat" w14:cmpd="sng" w14:algn="ctr">
+                                <w14:noFill/>
+                                <w14:prstDash w14:val="solid"/>
+                                <w14:round/>
+                              </w14:textOutline>
+                              <w14:props3d w14:extrusionH="57150" w14:contourW="0" w14:prstMaterial="matte">
+                                <w14:bevelT w14:w="63500" w14:h="12700" w14:prst="angle"/>
+                                <w14:contourClr>
+                                  <w14:schemeClr w14:val="bg1">
+                                    <w14:lumMod w14:val="65000"/>
+                                  </w14:schemeClr>
+                                </w14:contourClr>
+                              </w14:props3d>
+                            </w:rPr>
+                            <w:t>RUC: 2350051930001</w:t>
+                          </w:r>
+                        </w:p>
+                      </w:txbxContent>
+                    </wps:txbx>
+                    <wps:bodyPr rot="0" spcFirstLastPara="0" vertOverflow="overflow" horzOverflow="overflow" vert="horz" wrap="square" lIns="91440" tIns="45720" rIns="91440" bIns="45720" numCol="1" spcCol="0" rtlCol="0" fromWordArt="0" anchor="ctr" anchorCtr="0" forceAA="0" compatLnSpc="1">
+                      <a:prstTxWarp prst="textNoShape">
+                        <a:avLst/>
+                      </a:prstTxWarp>
+                      <a:noAutofit/>
+                    </wps:bodyPr>
+                  </wps:wsp>
+                </a:graphicData>
+              </a:graphic>
+              <wp14:sizeRelH relativeFrom="margin">
+                <wp14:pctWidth>0</wp14:pctWidth>
+              </wp14:sizeRelH>
+              <wp14:sizeRelV relativeFrom="margin">
+                <wp14:pctHeight>0</wp14:pctHeight>
+              </wp14:sizeRelV>
+            </wp:anchor>
+          </w:drawing>
+        </mc:Choice>
+        <mc:Fallback>
+          <w:pict>
+            <v:rect w14:anchorId="0F30BED5" id="Rectángulo 1" o:spid="_x0000_s1026" style="position:absolute;margin-left:164.7pt;margin-top:-17.4pt;width:126pt;height:19.5pt;z-index:-251655168;visibility:visible;mso-wrap-style:square;mso-width-percent:0;mso-height-percent:0;mso-wrap-distance-left:9pt;mso-wrap-distance-top:0;mso-wrap-distance-right:9pt;mso-wrap-distance-bottom:0;mso-position-horizontal:absolute;mso-position-horizontal-relative:text;mso-position-vertical:absolute;mso-position-vertical-relative:text;mso-width-percent:0;mso-height-percent:0;mso-width-relative:margin;mso-height-relative:margin;v-text-anchor:middle" o:gfxdata="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" filled="f" stroked="f" strokeweight="1pt">
+              <v:textbox>
+                <w:txbxContent>
+                  <w:p>
+                    <w:pPr>
+                      <w:rPr>
+                        <w:rFonts w:ascii="Times New Roman" w:hAnsi="Times New Roman" w:cs="Times New Roman"/>
+                        <w:b/>
+                        <w:bCs/>
+                        <w:color w:val="0A2F41" w:themeColor="accent1" w:themeShade="80"/>
+                        <w:sz w:val="22"/>
+                        <w:szCs w:val="22"/>
+                        <w:lang w:val="es-MX"/>
+                        <w14:textOutline w14:w="0" w14:cap="flat" w14:cmpd="sng" w14:algn="ctr">
+                          <w14:noFill/>
+                          <w14:prstDash w14:val="solid"/>
+                          <w14:round/>
+                        </w14:textOutline>
+                        <w14:props3d w14:extrusionH="57150" w14:contourW="0" w14:prstMaterial="matte">
+                          <w14:bevelT w14:w="63500" w14:h="12700" w14:prst="angle"/>
+                          <w14:contourClr>
+                            <w14:schemeClr w14:val="bg1">
+                              <w14:lumMod w14:val="65000"/>
+                            </w14:schemeClr>
+                          </w14:contourClr>
+                        </w14:props3d>
+                      </w:rPr>
+                    </w:pPr>
+                    <w:r>
+                      <w:rPr>
+                        <w:rFonts w:ascii="Times New Roman" w:hAnsi="Times New Roman" w:cs="Times New Roman"/>
+                        <w:b/>
+                        <w:bCs/>
+                        <w:color w:val="0A2F41" w:themeColor="accent1" w:themeShade="80"/>
+                        <w:sz w:val="22"/>
+                        <w:szCs w:val="22"/>
+                        <w:lang w:val="es-MX"/>
+                        <w14:textOutline w14:w="0" w14:cap="flat" w14:cmpd="sng" w14:algn="ctr">
+                          <w14:noFill/>
+                          <w14:prstDash w14:val="solid"/>
+                          <w14:round/>
+                        </w14:textOutline>
+                        <w14:props3d w14:extrusionH="57150" w14:contourW="0" w14:prstMaterial="matte">
+                          <w14:bevelT w14:w="63500" w14:h="12700" w14:prst="angle"/>
+                          <w14:contourClr>
+                            <w14:schemeClr w14:val="bg1">
+                              <w14:lumMod w14:val="65000"/>
+                            </w14:schemeClr>
+                          </w14:contourClr>
+                        </w14:props3d>
+                      </w:rPr>
+                      <w:t>RUC: 2350051930001</w:t>
+                    </w:r>
+                  </w:p>
+                </w:txbxContent>
+              </v:textbox>
+            </v:rect>
+          </w:pict>
+        </mc:Fallback>
+      </mc:AlternateContent>
+    </w:r>
+    <w:r>
+      <w:rPr>
+        <w:noProof/>
+      </w:rPr>
       <w:drawing>
-        <wp:anchor distT="0" distB="0" distL="114300" distR="114300" simplePos="0" relativeHeight="251659264" behindDoc="1" locked="0" layoutInCell="1" allowOverlap="1" wp14:anchorId="616FC9F7" wp14:editId="0FB26A54">
+        <wp:anchor distT="0" distB="0" distL="114300" distR="114300" simplePos="0" relativeHeight="251658240" behindDoc="1" locked="0" layoutInCell="1" allowOverlap="1" wp14:anchorId="51B4BBEE" wp14:editId="34689C4D">
           <wp:simplePos x="0" y="0"/>
           <wp:positionH relativeFrom="page">
             <wp:align>right</wp:align>
           </wp:positionH>
           <wp:positionV relativeFrom="paragraph">
-            <wp:posOffset>-450215</wp:posOffset>
+            <wp:posOffset>-449580</wp:posOffset>
           </wp:positionV>
           <wp:extent cx="7549515" cy="10677525"/>
           <wp:effectExtent l="0" t="0" r="0" b="9525"/>
@@ -277,6 +409,94 @@
       </w:drawing>
     </w:r>
   </w:p>
+  <w:p>
+    <w:pPr>
+      <w:pStyle w:val="Encabezado"/>
+    </w:pPr>
+    <w:r>
+      <w:rPr>
+        <w:noProof/>
+        <w:lang w:val="es-MX"/>
+      </w:rPr>
+      <w:drawing>
+        <wp:anchor distT="0" distB="0" distL="114300" distR="114300" simplePos="0" relativeHeight="251660288" behindDoc="1" locked="0" layoutInCell="1" allowOverlap="1" wp14:anchorId="62D547ED" wp14:editId="14504F67">
+          <wp:simplePos x="0" y="0"/>
+          <wp:positionH relativeFrom="margin">
+            <wp:posOffset>558165</wp:posOffset>
+          </wp:positionH>
+          <wp:positionV relativeFrom="paragraph">
+            <wp:posOffset>2679065</wp:posOffset>
+          </wp:positionV>
+          <wp:extent cx="4302125" cy="4038600"/>
+          <wp:effectExtent l="0" t="0" r="3175" b="0"/>
+          <wp:wrapNone/>
+          <wp:docPr id="36190429" name="Imagen 4"/>
+          <wp:cNvGraphicFramePr>
+            <a:graphicFrameLocks xmlns:a="http://schemas.openxmlformats.org/drawingml/2006/main" noChangeAspect="1"/>
+          </wp:cNvGraphicFramePr>
+          <a:graphic xmlns:a="http://schemas.openxmlformats.org/drawingml/2006/main">
+            <a:graphicData uri="http://schemas.openxmlformats.org/drawingml/2006/picture">
+              <pic:pic xmlns:pic="http://schemas.openxmlformats.org/drawingml/2006/picture">
+                <pic:nvPicPr>
+                  <pic:cNvPr id="0" name="Picture 2"/>
+                  <pic:cNvPicPr>
+                    <a:picLocks noChangeAspect="1" noChangeArrowheads="1"/>
+                  </pic:cNvPicPr>
+                </pic:nvPicPr>
+                <pic:blipFill rotWithShape="1">
+                  <a:blip r:embed="rId2">
+                    <a:alphaModFix amt="20000"/>
+                    <a:extLst>
+                      <a:ext uri="{BEBA8EAE-BF5A-486C-A8C5-ECC9F3942E4B}">
+                        <a14:imgProps xmlns:a14="http://schemas.microsoft.com/office/drawing/2010/main">
+                          <a14:imgLayer r:embed="rId3">
+                            <a14:imgEffect>
+                              <a14:brightnessContrast bright="40000" contrast="-40000"/>
+                            </a14:imgEffect>
+                          </a14:imgLayer>
+                        </a14:imgProps>
+                      </a:ext>
+                      <a:ext uri="{28A0092B-C50C-407E-A947-70E740481C1C}">
+                        <a14:useLocalDpi xmlns:a14="http://schemas.microsoft.com/office/drawing/2010/main" val="0"/>
+                      </a:ext>
+                    </a:extLst>
+                  </a:blip>
+                  <a:srcRect l="15817" r="16665"/>
+                  <a:stretch>
+                    <a:fillRect/>
+                  </a:stretch>
+                </pic:blipFill>
+                <pic:spPr bwMode="auto">
+                  <a:xfrm>
+                    <a:off x="0" y="0"/>
+                    <a:ext cx="4302125" cy="4038600"/>
+                  </a:xfrm>
+                  <a:prstGeom prst="rect">
+                    <a:avLst/>
+                  </a:prstGeom>
+                  <a:noFill/>
+                  <a:ln>
+                    <a:noFill/>
+                  </a:ln>
+                  <a:extLst>
+                    <a:ext uri="{53640926-AAD7-44D8-BBD7-CCE9431645EC}">
+                      <a14:shadowObscured xmlns:a14="http://schemas.microsoft.com/office/drawing/2010/main"/>
+                    </a:ext>
+                  </a:extLst>
+                </pic:spPr>
+              </pic:pic>
+            </a:graphicData>
+          </a:graphic>
+          <wp14:sizeRelH relativeFrom="page">
+            <wp14:pctWidth>0</wp14:pctWidth>
+          </wp14:sizeRelH>
+          <wp14:sizeRelV relativeFrom="page">
+            <wp14:pctHeight>0</wp14:pctHeight>
+          </wp14:sizeRelV>
+        </wp:anchor>
+      </w:drawing>
+    </w:r>
+  </w:p>
 </w:hdr>
 </file>
 
@@ -287,15 +507,15 @@
       <w:rPr>
         <w:rFonts w:asciiTheme="minorHAnsi" w:eastAsiaTheme="minorHAnsi" w:hAnsiTheme="minorHAnsi" w:cstheme="minorBidi"/>
         <w:kern w:val="2"/>
-        <w:sz w:val="22"/>
-        <w:szCs w:val="22"/>
+        <w:sz w:val="24"/>
+        <w:szCs w:val="24"/>
         <w:lang w:val="es-EC" w:eastAsia="en-US" w:bidi="ar-SA"/>
         <w14:ligatures w14:val="standardContextual"/>
       </w:rPr>
     </w:rPrDefault>
     <w:pPrDefault>
       <w:pPr>
-        <w:spacing w:after="160" w:line="259" w:lineRule="auto"/>
+        <w:spacing w:after="160" w:line="278" w:lineRule="auto"/>
       </w:pPr>
     </w:pPrDefault>
   </w:docDefaults>
@@ -680,7 +900,6 @@
   <w:style w:type="paragraph" w:default="1" w:styleId="Normal">
     <w:name w:val="Normal"/>
     <w:qFormat/>
-    <w:rsid w:val="003A4C5F"/>
   </w:style>
   <w:style w:type="paragraph" w:styleId="Ttulo1">
     <w:name w:val="heading 1"/>
@@ -689,7 +908,7 @@
     <w:link w:val="Ttulo1Car"/>
     <w:uiPriority w:val="9"/>
     <w:qFormat/>
-    <w:rsid w:val="003A4C5F"/>
+    <w:rsid w:val="00105700"/>
     <w:pPr>
       <w:keepNext/>
       <w:keepLines/>
@@ -698,7 +917,7 @@
     </w:pPr>
     <w:rPr>
       <w:rFonts w:asciiTheme="majorHAnsi" w:eastAsiaTheme="majorEastAsia" w:hAnsiTheme="majorHAnsi" w:cstheme="majorBidi"/>
-      <w:color w:val="2F5496" w:themeColor="accent1" w:themeShade="BF"/>
+      <w:color w:val="0F4761" w:themeColor="accent1" w:themeShade="BF"/>
       <w:sz w:val="40"/>
       <w:szCs w:val="40"/>
     </w:rPr>
@@ -712,7 +931,7 @@
     <w:semiHidden/>
     <w:unhideWhenUsed/>
     <w:qFormat/>
-    <w:rsid w:val="003A4C5F"/>
+    <w:rsid w:val="00105700"/>
     <w:pPr>
       <w:keepNext/>
       <w:keepLines/>
@@ -721,7 +940,7 @@
     </w:pPr>
     <w:rPr>
       <w:rFonts w:asciiTheme="majorHAnsi" w:eastAsiaTheme="majorEastAsia" w:hAnsiTheme="majorHAnsi" w:cstheme="majorBidi"/>
-      <w:color w:val="2F5496" w:themeColor="accent1" w:themeShade="BF"/>
+      <w:color w:val="0F4761" w:themeColor="accent1" w:themeShade="BF"/>
       <w:sz w:val="32"/>
       <w:szCs w:val="32"/>
     </w:rPr>
@@ -735,7 +954,7 @@
     <w:semiHidden/>
     <w:unhideWhenUsed/>
     <w:qFormat/>
-    <w:rsid w:val="003A4C5F"/>
+    <w:rsid w:val="00105700"/>
     <w:pPr>
       <w:keepNext/>
       <w:keepLines/>
@@ -744,7 +963,7 @@
     </w:pPr>
     <w:rPr>
       <w:rFonts w:eastAsiaTheme="majorEastAsia" w:cstheme="majorBidi"/>
-      <w:color w:val="2F5496" w:themeColor="accent1" w:themeShade="BF"/>
+      <w:color w:val="0F4761" w:themeColor="accent1" w:themeShade="BF"/>
       <w:sz w:val="28"/>
       <w:szCs w:val="28"/>
     </w:rPr>
@@ -758,7 +977,7 @@
     <w:semiHidden/>
     <w:unhideWhenUsed/>
     <w:qFormat/>
-    <w:rsid w:val="003A4C5F"/>
+    <w:rsid w:val="00105700"/>
     <w:pPr>
       <w:keepNext/>
       <w:keepLines/>
@@ -769,7 +988,7 @@
       <w:rFonts w:eastAsiaTheme="majorEastAsia" w:cstheme="majorBidi"/>
       <w:i/>
       <w:iCs/>
-      <w:color w:val="2F5496" w:themeColor="accent1" w:themeShade="BF"/>
+      <w:color w:val="0F4761" w:themeColor="accent1" w:themeShade="BF"/>
     </w:rPr>
   </w:style>
   <w:style w:type="paragraph" w:styleId="Ttulo5">
@@ -781,7 +1000,7 @@
     <w:semiHidden/>
     <w:unhideWhenUsed/>
     <w:qFormat/>
-    <w:rsid w:val="003A4C5F"/>
+    <w:rsid w:val="00105700"/>
     <w:pPr>
       <w:keepNext/>
       <w:keepLines/>
@@ -790,7 +1009,7 @@
     </w:pPr>
     <w:rPr>
       <w:rFonts w:eastAsiaTheme="majorEastAsia" w:cstheme="majorBidi"/>
-      <w:color w:val="2F5496" w:themeColor="accent1" w:themeShade="BF"/>
+      <w:color w:val="0F4761" w:themeColor="accent1" w:themeShade="BF"/>
     </w:rPr>
   </w:style>
   <w:style w:type="paragraph" w:styleId="Ttulo6">
@@ -802,7 +1021,7 @@
     <w:semiHidden/>
     <w:unhideWhenUsed/>
     <w:qFormat/>
-    <w:rsid w:val="003A4C5F"/>
+    <w:rsid w:val="00105700"/>
     <w:pPr>
       <w:keepNext/>
       <w:keepLines/>
@@ -825,7 +1044,7 @@
     <w:semiHidden/>
     <w:unhideWhenUsed/>
     <w:qFormat/>
-    <w:rsid w:val="003A4C5F"/>
+    <w:rsid w:val="00105700"/>
     <w:pPr>
       <w:keepNext/>
       <w:keepLines/>
@@ -846,7 +1065,7 @@
     <w:semiHidden/>
     <w:unhideWhenUsed/>
     <w:qFormat/>
-    <w:rsid w:val="003A4C5F"/>
+    <w:rsid w:val="00105700"/>
     <w:pPr>
       <w:keepNext/>
       <w:keepLines/>
@@ -869,7 +1088,7 @@
     <w:semiHidden/>
     <w:unhideWhenUsed/>
     <w:qFormat/>
-    <w:rsid w:val="003A4C5F"/>
+    <w:rsid w:val="00105700"/>
     <w:pPr>
       <w:keepNext/>
       <w:keepLines/>
@@ -913,10 +1132,10 @@
     <w:basedOn w:val="Fuentedeprrafopredeter"/>
     <w:link w:val="Ttulo1"/>
     <w:uiPriority w:val="9"/>
-    <w:rsid w:val="003A4C5F"/>
+    <w:rsid w:val="00105700"/>
     <w:rPr>
       <w:rFonts w:asciiTheme="majorHAnsi" w:eastAsiaTheme="majorEastAsia" w:hAnsiTheme="majorHAnsi" w:cstheme="majorBidi"/>
-      <w:color w:val="2F5496" w:themeColor="accent1" w:themeShade="BF"/>
+      <w:color w:val="0F4761" w:themeColor="accent1" w:themeShade="BF"/>
       <w:sz w:val="40"/>
       <w:szCs w:val="40"/>
     </w:rPr>
@@ -927,10 +1146,10 @@
     <w:link w:val="Ttulo2"/>
     <w:uiPriority w:val="9"/>
     <w:semiHidden/>
-    <w:rsid w:val="003A4C5F"/>
+    <w:rsid w:val="00105700"/>
     <w:rPr>
       <w:rFonts w:asciiTheme="majorHAnsi" w:eastAsiaTheme="majorEastAsia" w:hAnsiTheme="majorHAnsi" w:cstheme="majorBidi"/>
-      <w:color w:val="2F5496" w:themeColor="accent1" w:themeShade="BF"/>
+      <w:color w:val="0F4761" w:themeColor="accent1" w:themeShade="BF"/>
       <w:sz w:val="32"/>
       <w:szCs w:val="32"/>
     </w:rPr>
@@ -941,10 +1160,10 @@
     <w:link w:val="Ttulo3"/>
     <w:uiPriority w:val="9"/>
     <w:semiHidden/>
-    <w:rsid w:val="003A4C5F"/>
+    <w:rsid w:val="00105700"/>
     <w:rPr>
       <w:rFonts w:eastAsiaTheme="majorEastAsia" w:cstheme="majorBidi"/>
-      <w:color w:val="2F5496" w:themeColor="accent1" w:themeShade="BF"/>
+      <w:color w:val="0F4761" w:themeColor="accent1" w:themeShade="BF"/>
       <w:sz w:val="28"/>
       <w:szCs w:val="28"/>
     </w:rPr>
@@ -955,12 +1174,12 @@
     <w:link w:val="Ttulo4"/>
     <w:uiPriority w:val="9"/>
     <w:semiHidden/>
-    <w:rsid w:val="003A4C5F"/>
+    <w:rsid w:val="00105700"/>
     <w:rPr>
       <w:rFonts w:eastAsiaTheme="majorEastAsia" w:cstheme="majorBidi"/>
       <w:i/>
       <w:iCs/>
-      <w:color w:val="2F5496" w:themeColor="accent1" w:themeShade="BF"/>
+      <w:color w:val="0F4761" w:themeColor="accent1" w:themeShade="BF"/>
     </w:rPr>
   </w:style>
   <w:style w:type="character" w:customStyle="1" w:styleId="Ttulo5Car">
@@ -969,10 +1188,10 @@
     <w:link w:val="Ttulo5"/>
     <w:uiPriority w:val="9"/>
     <w:semiHidden/>
-    <w:rsid w:val="003A4C5F"/>
+    <w:rsid w:val="00105700"/>
     <w:rPr>
       <w:rFonts w:eastAsiaTheme="majorEastAsia" w:cstheme="majorBidi"/>
-      <w:color w:val="2F5496" w:themeColor="accent1" w:themeShade="BF"/>
+      <w:color w:val="0F4761" w:themeColor="accent1" w:themeShade="BF"/>
     </w:rPr>
   </w:style>
   <w:style w:type="character" w:customStyle="1" w:styleId="Ttulo6Car">
@@ -981,7 +1200,7 @@
     <w:link w:val="Ttulo6"/>
     <w:uiPriority w:val="9"/>
     <w:semiHidden/>
-    <w:rsid w:val="003A4C5F"/>
+    <w:rsid w:val="00105700"/>
     <w:rPr>
       <w:rFonts w:eastAsiaTheme="majorEastAsia" w:cstheme="majorBidi"/>
       <w:i/>
@@ -995,7 +1214,7 @@
     <w:link w:val="Ttulo7"/>
     <w:uiPriority w:val="9"/>
     <w:semiHidden/>
-    <w:rsid w:val="003A4C5F"/>
+    <w:rsid w:val="00105700"/>
     <w:rPr>
       <w:rFonts w:eastAsiaTheme="majorEastAsia" w:cstheme="majorBidi"/>
       <w:color w:val="595959" w:themeColor="text1" w:themeTint="A6"/>
@@ -1007,7 +1226,7 @@
     <w:link w:val="Ttulo8"/>
     <w:uiPriority w:val="9"/>
     <w:semiHidden/>
-    <w:rsid w:val="003A4C5F"/>
+    <w:rsid w:val="00105700"/>
     <w:rPr>
       <w:rFonts w:eastAsiaTheme="majorEastAsia" w:cstheme="majorBidi"/>
       <w:i/>
@@ -1021,7 +1240,7 @@
     <w:link w:val="Ttulo9"/>
     <w:uiPriority w:val="9"/>
     <w:semiHidden/>
-    <w:rsid w:val="003A4C5F"/>
+    <w:rsid w:val="00105700"/>
     <w:rPr>
       <w:rFonts w:eastAsiaTheme="majorEastAsia" w:cstheme="majorBidi"/>
       <w:color w:val="272727" w:themeColor="text1" w:themeTint="D8"/>
@@ -1034,7 +1253,7 @@
     <w:link w:val="TtuloCar"/>
     <w:uiPriority w:val="10"/>
     <w:qFormat/>
-    <w:rsid w:val="003A4C5F"/>
+    <w:rsid w:val="00105700"/>
     <w:pPr>
       <w:spacing w:after="80" w:line="240" w:lineRule="auto"/>
       <w:contextualSpacing/>
@@ -1052,7 +1271,7 @@
     <w:basedOn w:val="Fuentedeprrafopredeter"/>
     <w:link w:val="Ttulo"/>
     <w:uiPriority w:val="10"/>
-    <w:rsid w:val="003A4C5F"/>
+    <w:rsid w:val="00105700"/>
     <w:rPr>
       <w:rFonts w:asciiTheme="majorHAnsi" w:eastAsiaTheme="majorEastAsia" w:hAnsiTheme="majorHAnsi" w:cstheme="majorBidi"/>
       <w:spacing w:val="-10"/>
@@ -1068,7 +1287,7 @@
     <w:link w:val="SubttuloCar"/>
     <w:uiPriority w:val="11"/>
     <w:qFormat/>
-    <w:rsid w:val="003A4C5F"/>
+    <w:rsid w:val="00105700"/>
     <w:pPr>
       <w:numPr>
         <w:ilvl w:val="1"/>
@@ -1087,7 +1306,7 @@
     <w:basedOn w:val="Fuentedeprrafopredeter"/>
     <w:link w:val="Subttulo"/>
     <w:uiPriority w:val="11"/>
-    <w:rsid w:val="003A4C5F"/>
+    <w:rsid w:val="00105700"/>
     <w:rPr>
       <w:rFonts w:eastAsiaTheme="majorEastAsia" w:cstheme="majorBidi"/>
       <w:color w:val="595959" w:themeColor="text1" w:themeTint="A6"/>
@@ -1103,7 +1322,7 @@
     <w:link w:val="CitaCar"/>
     <w:uiPriority w:val="29"/>
     <w:qFormat/>
-    <w:rsid w:val="003A4C5F"/>
+    <w:rsid w:val="00105700"/>
     <w:pPr>
       <w:spacing w:before="160"/>
       <w:jc w:val="center"/>
@@ -1119,7 +1338,7 @@
     <w:basedOn w:val="Fuentedeprrafopredeter"/>
     <w:link w:val="Cita"/>
     <w:uiPriority w:val="29"/>
-    <w:rsid w:val="003A4C5F"/>
+    <w:rsid w:val="00105700"/>
     <w:rPr>
       <w:i/>
       <w:iCs/>
@@ -1131,7 +1350,7 @@
     <w:basedOn w:val="Normal"/>
     <w:uiPriority w:val="34"/>
     <w:qFormat/>
-    <w:rsid w:val="003A4C5F"/>
+    <w:rsid w:val="00105700"/>
     <w:pPr>
       <w:ind w:left="720"/>
       <w:contextualSpacing/>
@@ -1142,11 +1361,11 @@
     <w:basedOn w:val="Fuentedeprrafopredeter"/>
     <w:uiPriority w:val="21"/>
     <w:qFormat/>
-    <w:rsid w:val="003A4C5F"/>
+    <w:rsid w:val="00105700"/>
     <w:rPr>
       <w:i/>
       <w:iCs/>
-      <w:color w:val="2F5496" w:themeColor="accent1" w:themeShade="BF"/>
+      <w:color w:val="0F4761" w:themeColor="accent1" w:themeShade="BF"/>
     </w:rPr>
   </w:style>
   <w:style w:type="paragraph" w:styleId="Citadestacada">
@@ -1156,11 +1375,11 @@
     <w:link w:val="CitadestacadaCar"/>
     <w:uiPriority w:val="30"/>
     <w:qFormat/>
-    <w:rsid w:val="003A4C5F"/>
+    <w:rsid w:val="00105700"/>
     <w:pPr>
       <w:pBdr>
-        <w:top w:val="single" w:sz="4" w:space="10" w:color="2F5496" w:themeColor="accent1" w:themeShade="BF"/>
-        <w:bottom w:val="single" w:sz="4" w:space="10" w:color="2F5496" w:themeColor="accent1" w:themeShade="BF"/>
+        <w:top w:val="single" w:sz="4" w:space="10" w:color="0F4761" w:themeColor="accent1" w:themeShade="BF"/>
+        <w:bottom w:val="single" w:sz="4" w:space="10" w:color="0F4761" w:themeColor="accent1" w:themeShade="BF"/>
       </w:pBdr>
       <w:spacing w:before="360" w:after="360"/>
       <w:ind w:left="864" w:right="864"/>
@@ -1169,7 +1388,7 @@
     <w:rPr>
       <w:i/>
       <w:iCs/>
-      <w:color w:val="2F5496" w:themeColor="accent1" w:themeShade="BF"/>
+      <w:color w:val="0F4761" w:themeColor="accent1" w:themeShade="BF"/>
     </w:rPr>
   </w:style>
   <w:style w:type="character" w:customStyle="1" w:styleId="CitadestacadaCar">
@@ -1177,11 +1396,11 @@
     <w:basedOn w:val="Fuentedeprrafopredeter"/>
     <w:link w:val="Citadestacada"/>
     <w:uiPriority w:val="30"/>
-    <w:rsid w:val="003A4C5F"/>
+    <w:rsid w:val="00105700"/>
     <w:rPr>
       <w:i/>
       <w:iCs/>
-      <w:color w:val="2F5496" w:themeColor="accent1" w:themeShade="BF"/>
+      <w:color w:val="0F4761" w:themeColor="accent1" w:themeShade="BF"/>
     </w:rPr>
   </w:style>
   <w:style w:type="character" w:styleId="Referenciaintensa">
@@ -1189,32 +1408,84 @@
     <w:basedOn w:val="Fuentedeprrafopredeter"/>
     <w:uiPriority w:val="32"/>
     <w:qFormat/>
-    <w:rsid w:val="003A4C5F"/>
+    <w:rsid w:val="00105700"/>
     <w:rPr>
       <w:b/>
       <w:bCs/>
       <w:smallCaps/>
-      <w:color w:val="2F5496" w:themeColor="accent1" w:themeShade="BF"/>
+      <w:color w:val="0F4761" w:themeColor="accent1" w:themeShade="BF"/>
       <w:spacing w:val="5"/>
     </w:rPr>
+  </w:style>
+  <w:style w:type="paragraph" w:styleId="Encabezado">
+    <w:name w:val="header"/>
+    <w:basedOn w:val="Normal"/>
+    <w:link w:val="EncabezadoCar"/>
+    <w:uiPriority w:val="99"/>
+    <w:unhideWhenUsed/>
+    <w:rsid w:val="00105700"/>
+    <w:pPr>
+      <w:tabs>
+        <w:tab w:val="center" w:pos="4252"/>
+        <w:tab w:val="right" w:pos="8504"/>
+      </w:tabs>
+      <w:spacing w:after="0" w:line="240" w:lineRule="auto"/>
+    </w:pPr>
+  </w:style>
+  <w:style w:type="character" w:customStyle="1" w:styleId="EncabezadoCar">
+    <w:name w:val="Encabezado Car"/>
+    <w:basedOn w:val="Fuentedeprrafopredeter"/>
+    <w:link w:val="Encabezado"/>
+    <w:uiPriority w:val="99"/>
+    <w:rsid w:val="00105700"/>
+  </w:style>
+  <w:style w:type="paragraph" w:styleId="Piedepgina">
+    <w:name w:val="footer"/>
+    <w:basedOn w:val="Normal"/>
+    <w:link w:val="PiedepginaCar"/>
+    <w:uiPriority w:val="99"/>
+    <w:unhideWhenUsed/>
+    <w:rsid w:val="00105700"/>
+    <w:pPr>
+      <w:tabs>
+        <w:tab w:val="center" w:pos="4252"/>
+        <w:tab w:val="right" w:pos="8504"/>
+      </w:tabs>
+      <w:spacing w:after="0" w:line="240" w:lineRule="auto"/>
+    </w:pPr>
+  </w:style>
+  <w:style w:type="character" w:customStyle="1" w:styleId="PiedepginaCar">
+    <w:name w:val="Pie de página Car"/>
+    <w:basedOn w:val="Fuentedeprrafopredeter"/>
+    <w:link w:val="Piedepgina"/>
+    <w:uiPriority w:val="99"/>
+    <w:rsid w:val="00105700"/>
   </w:style>
   <w:style w:type="paragraph" w:styleId="Sinespaciado">
     <w:name w:val="No Spacing"/>
     <w:uiPriority w:val="1"/>
     <w:qFormat/>
-    <w:rsid w:val="003A4C5F"/>
+    <w:rsid w:val="00F061EA"/>
     <w:pPr>
       <w:spacing w:after="0" w:line="240" w:lineRule="auto"/>
     </w:pPr>
+    <w:rPr>
+      <w:sz w:val="22"/>
+      <w:szCs w:val="22"/>
+    </w:rPr>
   </w:style>
   <w:style w:type="table" w:styleId="Tablaconcuadrcula">
     <w:name w:val="Table Grid"/>
     <w:basedOn w:val="Tablanormal"/>
     <w:uiPriority w:val="39"/>
-    <w:rsid w:val="003A4C5F"/>
+    <w:rsid w:val="00F061EA"/>
     <w:pPr>
       <w:spacing w:after="0" w:line="240" w:lineRule="auto"/>
     </w:pPr>
+    <w:rPr>
+      <w:sz w:val="22"/>
+      <w:szCs w:val="22"/>
+    </w:rPr>
     <w:tblPr>
       <w:tblBorders>
         <w:top w:val="single" w:sz="4" w:space="0" w:color="auto"/>
@@ -1225,50 +1496,6 @@
         <w:insideV w:val="single" w:sz="4" w:space="0" w:color="auto"/>
       </w:tblBorders>
     </w:tblPr>
-  </w:style>
-  <w:style w:type="paragraph" w:styleId="Encabezado">
-    <w:name w:val="header"/>
-    <w:basedOn w:val="Normal"/>
-    <w:link w:val="EncabezadoCar"/>
-    <w:uiPriority w:val="99"/>
-    <w:unhideWhenUsed/>
-    <w:rsid w:val="003A4C5F"/>
-    <w:pPr>
-      <w:tabs>
-        <w:tab w:val="center" w:pos="4252"/>
-        <w:tab w:val="right" w:pos="8504"/>
-      </w:tabs>
-      <w:spacing w:after="0" w:line="240" w:lineRule="auto"/>
-    </w:pPr>
-  </w:style>
-  <w:style w:type="character" w:customStyle="1" w:styleId="EncabezadoCar">
-    <w:name w:val="Encabezado Car"/>
-    <w:basedOn w:val="Fuentedeprrafopredeter"/>
-    <w:link w:val="Encabezado"/>
-    <w:uiPriority w:val="99"/>
-    <w:rsid w:val="003A4C5F"/>
-  </w:style>
-  <w:style w:type="paragraph" w:styleId="Piedepgina">
-    <w:name w:val="footer"/>
-    <w:basedOn w:val="Normal"/>
-    <w:link w:val="PiedepginaCar"/>
-    <w:uiPriority w:val="99"/>
-    <w:unhideWhenUsed/>
-    <w:rsid w:val="003A4C5F"/>
-    <w:pPr>
-      <w:tabs>
-        <w:tab w:val="center" w:pos="4252"/>
-        <w:tab w:val="right" w:pos="8504"/>
-      </w:tabs>
-      <w:spacing w:after="0" w:line="240" w:lineRule="auto"/>
-    </w:pPr>
-  </w:style>
-  <w:style w:type="character" w:customStyle="1" w:styleId="PiedepginaCar">
-    <w:name w:val="Pie de página Car"/>
-    <w:basedOn w:val="Fuentedeprrafopredeter"/>
-    <w:link w:val="Piedepgina"/>
-    <w:uiPriority w:val="99"/>
-    <w:rsid w:val="003A4C5F"/>
   </w:style>
 </w:styles>
 </file>
@@ -1284,39 +1511,39 @@
         <a:sysClr val="window" lastClr="FFFFFF"/>
       </a:lt1>
       <a:dk2>
-        <a:srgbClr val="44546A"/>
+        <a:srgbClr val="0E2841"/>
       </a:dk2>
       <a:lt2>
-        <a:srgbClr val="E7E6E6"/>
+        <a:srgbClr val="E8E8E8"/>
       </a:lt2>
       <a:accent1>
-        <a:srgbClr val="4472C4"/>
+        <a:srgbClr val="156082"/>
       </a:accent1>
       <a:accent2>
-        <a:srgbClr val="ED7D31"/>
+        <a:srgbClr val="E97132"/>
       </a:accent2>
       <a:accent3>
-        <a:srgbClr val="A5A5A5"/>
+        <a:srgbClr val="196B24"/>
       </a:accent3>
       <a:accent4>
-        <a:srgbClr val="FFC000"/>
+        <a:srgbClr val="0F9ED5"/>
       </a:accent4>
       <a:accent5>
-        <a:srgbClr val="5B9BD5"/>
+        <a:srgbClr val="A02B93"/>
       </a:accent5>
       <a:accent6>
-        <a:srgbClr val="70AD47"/>
+        <a:srgbClr val="4EA72E"/>
       </a:accent6>
       <a:hlink>
-        <a:srgbClr val="0563C1"/>
+        <a:srgbClr val="467886"/>
       </a:hlink>
       <a:folHlink>
-        <a:srgbClr val="954F72"/>
+        <a:srgbClr val="96607D"/>
       </a:folHlink>
     </a:clrScheme>
     <a:fontScheme name="Office">
       <a:majorFont>
-        <a:latin typeface="Calibri Light" panose="020F0302020204030204"/>
+        <a:latin typeface="Aptos Display" panose="02110004020202020204"/>
         <a:ea typeface=""/>
         <a:cs typeface=""/>
         <a:font script="Jpan" typeface="游ゴシック Light"/>
@@ -1368,10 +1595,10 @@
         <a:font script="Tfng" typeface="Ebrima"/>
       </a:majorFont>
       <a:minorFont>
-        <a:latin typeface="Calibri" panose="020F0502020204030204"/>
+        <a:latin typeface="Aptos" panose="02110004020202020204"/>
         <a:ea typeface=""/>
         <a:cs typeface=""/>
-        <a:font script="Jpan" typeface="游ゴシック"/>
+        <a:font script="Jpan" typeface="游明朝"/>
         <a:font script="Hang" typeface="맑은 고딕"/>
         <a:font script="Hans" typeface="等线"/>
         <a:font script="Hant" typeface="新細明體"/>
@@ -1562,8 +1789,20 @@
   <a:extraClrSchemeLst/>
   <a:extLst>
     <a:ext uri="{05A4C25C-085E-4340-85A3-A5531E510DB2}">
-      <thm15:themeFamily xmlns:thm15="http://schemas.microsoft.com/office/thememl/2012/main" name="Office Theme" id="{62F939B6-93AF-4DB8-9C6B-D6C7DFDC589F}" vid="{4A3C46E8-61CC-4603-A589-7422A47A8E4A}"/>
+      <thm15:themeFamily xmlns:thm15="http://schemas.microsoft.com/office/thememl/2012/main" name="Office Theme" id="{2E142A2C-CD16-42D6-873A-C26D2A0506FA}" vid="{1BDDFF52-6CD6-40A5-AB3C-68EB2F1E4D0A}"/>
     </a:ext>
   </a:extLst>
 </a:theme>
+</file>
+
+<file path=customXml/item1.xml><?xml version="1.0" encoding="utf-8"?>
+<b:Sources xmlns:b="http://schemas.openxmlformats.org/officeDocument/2006/bibliography" xmlns="http://schemas.openxmlformats.org/officeDocument/2006/bibliography" SelectedStyle="\APASixthEditionOfficeOnline.xsl" StyleName="APA" Version="6"/>
+</file>
+
+<file path=customXml/itemProps1.xml><?xml version="1.0" encoding="utf-8"?>
+<ds:datastoreItem xmlns:ds="http://schemas.openxmlformats.org/officeDocument/2006/customXml" ds:itemID="{85DC4F98-D111-4851-87E4-138D2907583C}">
+  <ds:schemaRefs>
+    <ds:schemaRef ds:uri="http://schemas.openxmlformats.org/officeDocument/2006/bibliography"/>
+  </ds:schemaRefs>
+</ds:datastoreItem>
 </file>
</xml_diff>

<commit_message>
UPDATE PLANTILLA DE TEMPLATE
</commit_message>
<xml_diff>
--- a/uploads/templates/jhon/plantilla.docx
+++ b/uploads/templates/jhon/plantilla.docx
@@ -161,13 +161,13 @@
       <mc:AlternateContent>
         <mc:Choice Requires="wps">
           <w:drawing>
-            <wp:anchor distT="0" distB="0" distL="114300" distR="114300" simplePos="0" relativeHeight="251661312" behindDoc="1" locked="0" layoutInCell="1" allowOverlap="1" wp14:anchorId="0F30BED5" wp14:editId="664275AE">
+            <wp:anchor distT="0" distB="0" distL="114300" distR="114300" simplePos="0" relativeHeight="251661312" behindDoc="1" locked="0" layoutInCell="1" allowOverlap="1" wp14:anchorId="0F30BED5" wp14:editId="52AC0E78">
               <wp:simplePos x="0" y="0"/>
               <wp:positionH relativeFrom="column">
-                <wp:posOffset>2091690</wp:posOffset>
+                <wp:posOffset>2655570</wp:posOffset>
               </wp:positionH>
               <wp:positionV relativeFrom="paragraph">
-                <wp:posOffset>-220980</wp:posOffset>
+                <wp:posOffset>-121920</wp:posOffset>
               </wp:positionV>
               <wp:extent cx="1600200" cy="247650"/>
               <wp:effectExtent l="0" t="0" r="0" b="0"/>
@@ -280,7 +280,7 @@
         </mc:Choice>
         <mc:Fallback>
           <w:pict>
-            <v:rect w14:anchorId="0F30BED5" id="Rectángulo 1" o:spid="_x0000_s1026" style="position:absolute;margin-left:164.7pt;margin-top:-17.4pt;width:126pt;height:19.5pt;z-index:-251655168;visibility:visible;mso-wrap-style:square;mso-width-percent:0;mso-height-percent:0;mso-wrap-distance-left:9pt;mso-wrap-distance-top:0;mso-wrap-distance-right:9pt;mso-wrap-distance-bottom:0;mso-position-horizontal:absolute;mso-position-horizontal-relative:text;mso-position-vertical:absolute;mso-position-vertical-relative:text;mso-width-percent:0;mso-height-percent:0;mso-width-relative:margin;mso-height-relative:margin;v-text-anchor:middle" o:gfxdata="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" filled="f" stroked="f" strokeweight="1pt">
+            <v:rect w14:anchorId="0F30BED5" id="Rectángulo 1" o:spid="_x0000_s1026" style="position:absolute;margin-left:209.1pt;margin-top:-9.6pt;width:126pt;height:19.5pt;z-index:-251655168;visibility:visible;mso-wrap-style:square;mso-width-percent:0;mso-height-percent:0;mso-wrap-distance-left:9pt;mso-wrap-distance-top:0;mso-wrap-distance-right:9pt;mso-wrap-distance-bottom:0;mso-position-horizontal:absolute;mso-position-horizontal-relative:text;mso-position-vertical:absolute;mso-position-vertical-relative:text;mso-width-percent:0;mso-height-percent:0;mso-width-relative:margin;mso-height-relative:margin;v-text-anchor:middle" o:gfxdata="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" filled="f" stroked="f" strokeweight="1pt">
               <v:textbox>
                 <w:txbxContent>
                   <w:p>

</xml_diff>

<commit_message>
UPDATE PLANTILLA, Y FONDO DE IMAGEN
</commit_message>
<xml_diff>
--- a/uploads/templates/jhon/plantilla.docx
+++ b/uploads/templates/jhon/plantilla.docx
@@ -5,13 +5,7 @@
     <w:p>
       <w:pPr>
         <w:rPr>
-          <w:lang w:val="es-MX"/>
-        </w:rPr>
-      </w:pPr>
-    </w:p>
-    <w:p>
-      <w:pPr>
-        <w:rPr>
+          <w:noProof/>
           <w:lang w:val="es-MX"/>
         </w:rPr>
       </w:pPr>
@@ -75,20 +69,72 @@
     <w:p>
       <w:pPr>
         <w:rPr>
-          <w:noProof/>
           <w:lang w:val="es-MX"/>
         </w:rPr>
       </w:pPr>
-    </w:p>
-    <w:p>
-      <w:pPr>
+      <w:r>
         <w:rPr>
-          <w:lang w:val="es-MX"/>
+          <w:noProof/>
         </w:rPr>
-      </w:pPr>
+        <w:drawing>
+          <wp:anchor distT="0" distB="0" distL="114300" distR="114300" simplePos="0" relativeHeight="251658240" behindDoc="1" locked="0" layoutInCell="1" allowOverlap="1" wp14:anchorId="7D3E02AA" wp14:editId="1171F1C7">
+            <wp:simplePos x="0" y="0"/>
+            <wp:positionH relativeFrom="margin">
+              <wp:posOffset>1091192</wp:posOffset>
+            </wp:positionH>
+            <wp:positionV relativeFrom="paragraph">
+              <wp:posOffset>902971</wp:posOffset>
+            </wp:positionV>
+            <wp:extent cx="4090274" cy="3836894"/>
+            <wp:effectExtent l="0" t="0" r="5715" b="0"/>
+            <wp:wrapNone/>
+            <wp:docPr id="20294457" name="Imagen 1"/>
+            <wp:cNvGraphicFramePr>
+              <a:graphicFrameLocks xmlns:a="http://schemas.openxmlformats.org/drawingml/2006/main" noChangeAspect="1"/>
+            </wp:cNvGraphicFramePr>
+            <a:graphic xmlns:a="http://schemas.openxmlformats.org/drawingml/2006/main">
+              <a:graphicData uri="http://schemas.openxmlformats.org/drawingml/2006/picture">
+                <pic:pic xmlns:pic="http://schemas.openxmlformats.org/drawingml/2006/picture">
+                  <pic:nvPicPr>
+                    <pic:cNvPr id="20294457" name=""/>
+                    <pic:cNvPicPr/>
+                  </pic:nvPicPr>
+                  <pic:blipFill>
+                    <a:blip r:embed="rId7">
+                      <a:extLst>
+                        <a:ext uri="{28A0092B-C50C-407E-A947-70E740481C1C}">
+                          <a14:useLocalDpi xmlns:a14="http://schemas.microsoft.com/office/drawing/2010/main" val="0"/>
+                        </a:ext>
+                      </a:extLst>
+                    </a:blip>
+                    <a:stretch>
+                      <a:fillRect/>
+                    </a:stretch>
+                  </pic:blipFill>
+                  <pic:spPr>
+                    <a:xfrm>
+                      <a:off x="0" y="0"/>
+                      <a:ext cx="4092878" cy="3839337"/>
+                    </a:xfrm>
+                    <a:prstGeom prst="rect">
+                      <a:avLst/>
+                    </a:prstGeom>
+                  </pic:spPr>
+                </pic:pic>
+              </a:graphicData>
+            </a:graphic>
+            <wp14:sizeRelH relativeFrom="page">
+              <wp14:pctWidth>0</wp14:pctWidth>
+            </wp14:sizeRelH>
+            <wp14:sizeRelV relativeFrom="page">
+              <wp14:pctHeight>0</wp14:pctHeight>
+            </wp14:sizeRelV>
+          </wp:anchor>
+        </w:drawing>
+      </w:r>
     </w:p>
     <w:sectPr>
-      <w:headerReference w:type="default" r:id="rId7"/>
+      <w:headerReference w:type="default" r:id="rId8"/>
       <w:pgSz w:w="11906" w:h="16838"/>
       <w:pgMar w:top="1701" w:right="851" w:bottom="1418" w:left="851" w:header="708" w:footer="708" w:gutter="0"/>
       <w:cols w:space="708"/>
@@ -158,206 +204,19 @@
       <w:rPr>
         <w:noProof/>
       </w:rPr>
-      <mc:AlternateContent>
-        <mc:Choice Requires="wps">
-          <w:drawing>
-            <wp:anchor distT="0" distB="0" distL="114300" distR="114300" simplePos="0" relativeHeight="251661312" behindDoc="1" locked="0" layoutInCell="1" allowOverlap="1" wp14:anchorId="0F30BED5" wp14:editId="52AC0E78">
-              <wp:simplePos x="0" y="0"/>
-              <wp:positionH relativeFrom="column">
-                <wp:posOffset>2655570</wp:posOffset>
-              </wp:positionH>
-              <wp:positionV relativeFrom="paragraph">
-                <wp:posOffset>-121920</wp:posOffset>
-              </wp:positionV>
-              <wp:extent cx="1600200" cy="247650"/>
-              <wp:effectExtent l="0" t="0" r="0" b="0"/>
-              <wp:wrapNone/>
-              <wp:docPr id="334908504" name="Rectángulo 1"/>
-              <wp:cNvGraphicFramePr/>
-              <a:graphic xmlns:a="http://schemas.openxmlformats.org/drawingml/2006/main">
-                <a:graphicData uri="http://schemas.microsoft.com/office/word/2010/wordprocessingShape">
-                  <wps:wsp>
-                    <wps:cNvSpPr/>
-                    <wps:spPr>
-                      <a:xfrm>
-                        <a:off x="0" y="0"/>
-                        <a:ext cx="1600200" cy="247650"/>
-                      </a:xfrm>
-                      <a:prstGeom prst="rect">
-                        <a:avLst/>
-                      </a:prstGeom>
-                      <a:noFill/>
-                      <a:ln>
-                        <a:noFill/>
-                      </a:ln>
-                    </wps:spPr>
-                    <wps:style>
-                      <a:lnRef idx="2">
-                        <a:schemeClr val="accent6"/>
-                      </a:lnRef>
-                      <a:fillRef idx="1">
-                        <a:schemeClr val="lt1"/>
-                      </a:fillRef>
-                      <a:effectRef idx="0">
-                        <a:schemeClr val="accent6"/>
-                      </a:effectRef>
-                      <a:fontRef idx="minor">
-                        <a:schemeClr val="dk1"/>
-                      </a:fontRef>
-                    </wps:style>
-                    <wps:txbx>
-                      <w:txbxContent>
-                        <w:p>
-                          <w:pPr>
-                            <w:rPr>
-                              <w:rFonts w:ascii="Times New Roman" w:hAnsi="Times New Roman" w:cs="Times New Roman"/>
-                              <w:b/>
-                              <w:bCs/>
-                              <w:color w:val="0A2F41" w:themeColor="accent1" w:themeShade="80"/>
-                              <w:sz w:val="22"/>
-                              <w:szCs w:val="22"/>
-                              <w:lang w:val="es-MX"/>
-                              <w14:textOutline w14:w="0" w14:cap="flat" w14:cmpd="sng" w14:algn="ctr">
-                                <w14:noFill/>
-                                <w14:prstDash w14:val="solid"/>
-                                <w14:round/>
-                              </w14:textOutline>
-                              <w14:props3d w14:extrusionH="57150" w14:contourW="0" w14:prstMaterial="matte">
-                                <w14:bevelT w14:w="63500" w14:h="12700" w14:prst="angle"/>
-                                <w14:contourClr>
-                                  <w14:schemeClr w14:val="bg1">
-                                    <w14:lumMod w14:val="65000"/>
-                                  </w14:schemeClr>
-                                </w14:contourClr>
-                              </w14:props3d>
-                            </w:rPr>
-                          </w:pPr>
-                          <w:r>
-                            <w:rPr>
-                              <w:rFonts w:ascii="Times New Roman" w:hAnsi="Times New Roman" w:cs="Times New Roman"/>
-                              <w:b/>
-                              <w:bCs/>
-                              <w:color w:val="0A2F41" w:themeColor="accent1" w:themeShade="80"/>
-                              <w:sz w:val="22"/>
-                              <w:szCs w:val="22"/>
-                              <w:lang w:val="es-MX"/>
-                              <w14:textOutline w14:w="0" w14:cap="flat" w14:cmpd="sng" w14:algn="ctr">
-                                <w14:noFill/>
-                                <w14:prstDash w14:val="solid"/>
-                                <w14:round/>
-                              </w14:textOutline>
-                              <w14:props3d w14:extrusionH="57150" w14:contourW="0" w14:prstMaterial="matte">
-                                <w14:bevelT w14:w="63500" w14:h="12700" w14:prst="angle"/>
-                                <w14:contourClr>
-                                  <w14:schemeClr w14:val="bg1">
-                                    <w14:lumMod w14:val="65000"/>
-                                  </w14:schemeClr>
-                                </w14:contourClr>
-                              </w14:props3d>
-                            </w:rPr>
-                            <w:t>RUC: 2350051930001</w:t>
-                          </w:r>
-                        </w:p>
-                      </w:txbxContent>
-                    </wps:txbx>
-                    <wps:bodyPr rot="0" spcFirstLastPara="0" vertOverflow="overflow" horzOverflow="overflow" vert="horz" wrap="square" lIns="91440" tIns="45720" rIns="91440" bIns="45720" numCol="1" spcCol="0" rtlCol="0" fromWordArt="0" anchor="ctr" anchorCtr="0" forceAA="0" compatLnSpc="1">
-                      <a:prstTxWarp prst="textNoShape">
-                        <a:avLst/>
-                      </a:prstTxWarp>
-                      <a:noAutofit/>
-                    </wps:bodyPr>
-                  </wps:wsp>
-                </a:graphicData>
-              </a:graphic>
-              <wp14:sizeRelH relativeFrom="margin">
-                <wp14:pctWidth>0</wp14:pctWidth>
-              </wp14:sizeRelH>
-              <wp14:sizeRelV relativeFrom="margin">
-                <wp14:pctHeight>0</wp14:pctHeight>
-              </wp14:sizeRelV>
-            </wp:anchor>
-          </w:drawing>
-        </mc:Choice>
-        <mc:Fallback>
-          <w:pict>
-            <v:rect w14:anchorId="0F30BED5" id="Rectángulo 1" o:spid="_x0000_s1026" style="position:absolute;margin-left:209.1pt;margin-top:-9.6pt;width:126pt;height:19.5pt;z-index:-251655168;visibility:visible;mso-wrap-style:square;mso-width-percent:0;mso-height-percent:0;mso-wrap-distance-left:9pt;mso-wrap-distance-top:0;mso-wrap-distance-right:9pt;mso-wrap-distance-bottom:0;mso-position-horizontal:absolute;mso-position-horizontal-relative:text;mso-position-vertical:absolute;mso-position-vertical-relative:text;mso-width-percent:0;mso-height-percent:0;mso-width-relative:margin;mso-height-relative:margin;v-text-anchor:middle" o:gfxdata="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" filled="f" stroked="f" strokeweight="1pt">
-              <v:textbox>
-                <w:txbxContent>
-                  <w:p>
-                    <w:pPr>
-                      <w:rPr>
-                        <w:rFonts w:ascii="Times New Roman" w:hAnsi="Times New Roman" w:cs="Times New Roman"/>
-                        <w:b/>
-                        <w:bCs/>
-                        <w:color w:val="0A2F41" w:themeColor="accent1" w:themeShade="80"/>
-                        <w:sz w:val="22"/>
-                        <w:szCs w:val="22"/>
-                        <w:lang w:val="es-MX"/>
-                        <w14:textOutline w14:w="0" w14:cap="flat" w14:cmpd="sng" w14:algn="ctr">
-                          <w14:noFill/>
-                          <w14:prstDash w14:val="solid"/>
-                          <w14:round/>
-                        </w14:textOutline>
-                        <w14:props3d w14:extrusionH="57150" w14:contourW="0" w14:prstMaterial="matte">
-                          <w14:bevelT w14:w="63500" w14:h="12700" w14:prst="angle"/>
-                          <w14:contourClr>
-                            <w14:schemeClr w14:val="bg1">
-                              <w14:lumMod w14:val="65000"/>
-                            </w14:schemeClr>
-                          </w14:contourClr>
-                        </w14:props3d>
-                      </w:rPr>
-                    </w:pPr>
-                    <w:r>
-                      <w:rPr>
-                        <w:rFonts w:ascii="Times New Roman" w:hAnsi="Times New Roman" w:cs="Times New Roman"/>
-                        <w:b/>
-                        <w:bCs/>
-                        <w:color w:val="0A2F41" w:themeColor="accent1" w:themeShade="80"/>
-                        <w:sz w:val="22"/>
-                        <w:szCs w:val="22"/>
-                        <w:lang w:val="es-MX"/>
-                        <w14:textOutline w14:w="0" w14:cap="flat" w14:cmpd="sng" w14:algn="ctr">
-                          <w14:noFill/>
-                          <w14:prstDash w14:val="solid"/>
-                          <w14:round/>
-                        </w14:textOutline>
-                        <w14:props3d w14:extrusionH="57150" w14:contourW="0" w14:prstMaterial="matte">
-                          <w14:bevelT w14:w="63500" w14:h="12700" w14:prst="angle"/>
-                          <w14:contourClr>
-                            <w14:schemeClr w14:val="bg1">
-                              <w14:lumMod w14:val="65000"/>
-                            </w14:schemeClr>
-                          </w14:contourClr>
-                        </w14:props3d>
-                      </w:rPr>
-                      <w:t>RUC: 2350051930001</w:t>
-                    </w:r>
-                  </w:p>
-                </w:txbxContent>
-              </v:textbox>
-            </v:rect>
-          </w:pict>
-        </mc:Fallback>
-      </mc:AlternateContent>
-    </w:r>
-    <w:r>
-      <w:rPr>
-        <w:noProof/>
-      </w:rPr>
       <w:drawing>
-        <wp:anchor distT="0" distB="0" distL="114300" distR="114300" simplePos="0" relativeHeight="251658240" behindDoc="1" locked="0" layoutInCell="1" allowOverlap="1" wp14:anchorId="51B4BBEE" wp14:editId="34689C4D">
+        <wp:anchor distT="0" distB="0" distL="114300" distR="114300" simplePos="0" relativeHeight="251661312" behindDoc="1" locked="0" layoutInCell="1" allowOverlap="1" wp14:anchorId="5ECB0103" wp14:editId="3DCC3872">
           <wp:simplePos x="0" y="0"/>
           <wp:positionH relativeFrom="page">
             <wp:align>right</wp:align>
           </wp:positionH>
           <wp:positionV relativeFrom="paragraph">
-            <wp:posOffset>-449580</wp:posOffset>
+            <wp:posOffset>-449377</wp:posOffset>
           </wp:positionV>
-          <wp:extent cx="7549515" cy="10677525"/>
-          <wp:effectExtent l="0" t="0" r="0" b="9525"/>
+          <wp:extent cx="7558391" cy="10690537"/>
+          <wp:effectExtent l="0" t="0" r="5080" b="0"/>
           <wp:wrapNone/>
-          <wp:docPr id="13591430" name="Imagen 2"/>
+          <wp:docPr id="425525814" name="Imagen 7"/>
           <wp:cNvGraphicFramePr>
             <a:graphicFrameLocks xmlns:a="http://schemas.openxmlformats.org/drawingml/2006/main" noChangeAspect="1"/>
           </wp:cNvGraphicFramePr>
@@ -365,7 +224,7 @@
             <a:graphicData uri="http://schemas.openxmlformats.org/drawingml/2006/picture">
               <pic:pic xmlns:pic="http://schemas.openxmlformats.org/drawingml/2006/picture">
                 <pic:nvPicPr>
-                  <pic:cNvPr id="0" name="Picture 6"/>
+                  <pic:cNvPr id="0" name="Picture 20"/>
                   <pic:cNvPicPr>
                     <a:picLocks noChangeAspect="1" noChangeArrowheads="1"/>
                   </pic:cNvPicPr>
@@ -386,7 +245,7 @@
                 <pic:spPr bwMode="auto">
                   <a:xfrm>
                     <a:off x="0" y="0"/>
-                    <a:ext cx="7549515" cy="10677525"/>
+                    <a:ext cx="7558391" cy="10690537"/>
                   </a:xfrm>
                   <a:prstGeom prst="rect">
                     <a:avLst/>
@@ -413,89 +272,16 @@
     <w:pPr>
       <w:pStyle w:val="Encabezado"/>
     </w:pPr>
-    <w:r>
-      <w:rPr>
-        <w:noProof/>
-        <w:lang w:val="es-MX"/>
-      </w:rPr>
-      <w:drawing>
-        <wp:anchor distT="0" distB="0" distL="114300" distR="114300" simplePos="0" relativeHeight="251660288" behindDoc="1" locked="0" layoutInCell="1" allowOverlap="1" wp14:anchorId="62D547ED" wp14:editId="14504F67">
-          <wp:simplePos x="0" y="0"/>
-          <wp:positionH relativeFrom="margin">
-            <wp:posOffset>558165</wp:posOffset>
-          </wp:positionH>
-          <wp:positionV relativeFrom="paragraph">
-            <wp:posOffset>2679065</wp:posOffset>
-          </wp:positionV>
-          <wp:extent cx="4302125" cy="4038600"/>
-          <wp:effectExtent l="0" t="0" r="3175" b="0"/>
-          <wp:wrapNone/>
-          <wp:docPr id="36190429" name="Imagen 4"/>
-          <wp:cNvGraphicFramePr>
-            <a:graphicFrameLocks xmlns:a="http://schemas.openxmlformats.org/drawingml/2006/main" noChangeAspect="1"/>
-          </wp:cNvGraphicFramePr>
-          <a:graphic xmlns:a="http://schemas.openxmlformats.org/drawingml/2006/main">
-            <a:graphicData uri="http://schemas.openxmlformats.org/drawingml/2006/picture">
-              <pic:pic xmlns:pic="http://schemas.openxmlformats.org/drawingml/2006/picture">
-                <pic:nvPicPr>
-                  <pic:cNvPr id="0" name="Picture 2"/>
-                  <pic:cNvPicPr>
-                    <a:picLocks noChangeAspect="1" noChangeArrowheads="1"/>
-                  </pic:cNvPicPr>
-                </pic:nvPicPr>
-                <pic:blipFill rotWithShape="1">
-                  <a:blip r:embed="rId2">
-                    <a:alphaModFix amt="20000"/>
-                    <a:extLst>
-                      <a:ext uri="{BEBA8EAE-BF5A-486C-A8C5-ECC9F3942E4B}">
-                        <a14:imgProps xmlns:a14="http://schemas.microsoft.com/office/drawing/2010/main">
-                          <a14:imgLayer r:embed="rId3">
-                            <a14:imgEffect>
-                              <a14:brightnessContrast bright="40000" contrast="-40000"/>
-                            </a14:imgEffect>
-                          </a14:imgLayer>
-                        </a14:imgProps>
-                      </a:ext>
-                      <a:ext uri="{28A0092B-C50C-407E-A947-70E740481C1C}">
-                        <a14:useLocalDpi xmlns:a14="http://schemas.microsoft.com/office/drawing/2010/main" val="0"/>
-                      </a:ext>
-                    </a:extLst>
-                  </a:blip>
-                  <a:srcRect l="15817" r="16665"/>
-                  <a:stretch>
-                    <a:fillRect/>
-                  </a:stretch>
-                </pic:blipFill>
-                <pic:spPr bwMode="auto">
-                  <a:xfrm>
-                    <a:off x="0" y="0"/>
-                    <a:ext cx="4302125" cy="4038600"/>
-                  </a:xfrm>
-                  <a:prstGeom prst="rect">
-                    <a:avLst/>
-                  </a:prstGeom>
-                  <a:noFill/>
-                  <a:ln>
-                    <a:noFill/>
-                  </a:ln>
-                  <a:extLst>
-                    <a:ext uri="{53640926-AAD7-44D8-BBD7-CCE9431645EC}">
-                      <a14:shadowObscured xmlns:a14="http://schemas.microsoft.com/office/drawing/2010/main"/>
-                    </a:ext>
-                  </a:extLst>
-                </pic:spPr>
-              </pic:pic>
-            </a:graphicData>
-          </a:graphic>
-          <wp14:sizeRelH relativeFrom="page">
-            <wp14:pctWidth>0</wp14:pctWidth>
-          </wp14:sizeRelH>
-          <wp14:sizeRelV relativeFrom="page">
-            <wp14:pctHeight>0</wp14:pctHeight>
-          </wp14:sizeRelV>
-        </wp:anchor>
-      </w:drawing>
-    </w:r>
+  </w:p>
+  <w:p>
+    <w:pPr>
+      <w:pStyle w:val="Encabezado"/>
+    </w:pPr>
+  </w:p>
+  <w:p>
+    <w:pPr>
+      <w:pStyle w:val="Encabezado"/>
+    </w:pPr>
   </w:p>
 </w:hdr>
 </file>
@@ -1465,7 +1251,7 @@
     <w:name w:val="No Spacing"/>
     <w:uiPriority w:val="1"/>
     <w:qFormat/>
-    <w:rsid w:val="00F061EA"/>
+    <w:rsid w:val="007516AB"/>
     <w:pPr>
       <w:spacing w:after="0" w:line="240" w:lineRule="auto"/>
     </w:pPr>
@@ -1478,7 +1264,7 @@
     <w:name w:val="Table Grid"/>
     <w:basedOn w:val="Tablanormal"/>
     <w:uiPriority w:val="39"/>
-    <w:rsid w:val="00F061EA"/>
+    <w:rsid w:val="007516AB"/>
     <w:pPr>
       <w:spacing w:after="0" w:line="240" w:lineRule="auto"/>
     </w:pPr>

</xml_diff>